<commit_message>
Added plot settings and optional derived
</commit_message>
<xml_diff>
--- a/Manuscript_BRM/Manuscript_OpenSourceRelationalNetworkDerivationVisualizationTaskGeneration.docx
+++ b/Manuscript_BRM/Manuscript_OpenSourceRelationalNetworkDerivationVisualizationTaskGeneration.docx
@@ -2689,7 +2689,23 @@
         <w:t xml:space="preserve"> Depending on the user’s chosen settings, the baseline and derived relations are then drawn as arrows connecting the stimuli, and labeled</w:t>
       </w:r>
       <w:r>
-        <w:t xml:space="preserve"> (relation abbreviated) and colored (for baseline, mutually or combinatorially entailed relations)</w:t>
+        <w:t xml:space="preserve"> (relation abbreviated) and colored (for </w:t>
+      </w:r>
+      <w:commentRangeStart w:id="4"/>
+      <w:r>
+        <w:t>baseline</w:t>
+      </w:r>
+      <w:commentRangeEnd w:id="4"/>
+      <w:r>
+        <w:rPr>
+          <w:rStyle w:val="CommentReference"/>
+          <w:sz w:val="24"/>
+          <w:szCs w:val="36"/>
+        </w:rPr>
+        <w:commentReference w:id="4"/>
+      </w:r>
+      <w:r>
+        <w:t>, mutually or combinatorially entailed relations)</w:t>
       </w:r>
       <w:r>
         <w:t>.</w:t>
@@ -2700,7 +2716,55 @@
         <w:pStyle w:val="APA7Body"/>
       </w:pPr>
       <w:r>
-        <w:t>App tutorial.</w:t>
+        <w:t>We also created a</w:t>
+      </w:r>
+      <w:r>
+        <w:t xml:space="preserve"> </w:t>
+      </w:r>
+      <w:r>
+        <w:t>more user-friendly</w:t>
+      </w:r>
+      <w:r>
+        <w:t xml:space="preserve"> </w:t>
+      </w:r>
+      <w:r>
+        <w:t xml:space="preserve">app </w:t>
+      </w:r>
+      <w:r>
+        <w:t>for the function described above, using Streamlit ().</w:t>
+      </w:r>
+      <w:r>
+        <w:t xml:space="preserve"> </w:t>
+      </w:r>
+      <w:r>
+        <w:t xml:space="preserve">The app requires users to first specify the </w:t>
+      </w:r>
+      <w:r>
+        <w:t>number of stimuli that make up the network (with labels) and the relations involved in the network</w:t>
+      </w:r>
+      <w:r>
+        <w:t xml:space="preserve"> (e.g., same, different, opposite to, more than, etc.)</w:t>
+      </w:r>
+      <w:r>
+        <w:t xml:space="preserve">. </w:t>
+      </w:r>
+      <w:r>
+        <w:t>Once these requirements are met, users can move on to specifying the baseline relational network</w:t>
+      </w:r>
+      <w:r>
+        <w:t xml:space="preserve"> by </w:t>
+      </w:r>
+      <w:r>
+        <w:t xml:space="preserve">choosing any number of instances </w:t>
+      </w:r>
+      <w:r>
+        <w:t>of each relation type (e.g., two difference</w:t>
+      </w:r>
+      <w:r>
+        <w:t xml:space="preserve"> relations and three opposition relations) and indicating the stimuli between which those relations hold.</w:t>
+      </w:r>
+      <w:r>
+        <w:t xml:space="preserve"> Optionally, users can specify a custom set of derived relations to be illustrated, if they do not want all possible derived relations to be included.</w:t>
       </w:r>
     </w:p>
     <w:p>
@@ -2732,7 +2796,111 @@
         <w:pStyle w:val="APA7H3"/>
       </w:pPr>
       <w:r>
-        <w:t>Generate a Match-to-Sample Task.</w:t>
+        <w:t>Match</w:t>
+      </w:r>
+      <w:r>
+        <w:t>ing</w:t>
+      </w:r>
+      <w:r>
+        <w:t xml:space="preserve">-to-Sample </w:t>
+      </w:r>
+      <w:r>
+        <w:t>Procedure Generator</w:t>
+      </w:r>
+    </w:p>
+    <w:p>
+      <w:pPr>
+        <w:pStyle w:val="APA7Body"/>
+      </w:pPr>
+      <w:r>
+        <w:t xml:space="preserve">The second tool we present in this manuscript </w:t>
+      </w:r>
+      <w:r>
+        <w:t xml:space="preserve">allows users to generate matching-to-sample procedures. </w:t>
+      </w:r>
+      <w:r>
+        <w:t xml:space="preserve">MTS procedures have long been used in </w:t>
+      </w:r>
+      <w:r>
+        <w:t xml:space="preserve">behavior-analytic research to study </w:t>
+      </w:r>
+      <w:r>
+        <w:lastRenderedPageBreak/>
+        <w:t xml:space="preserve">stimulus equivalence </w:t>
+      </w:r>
+      <w:r>
+        <w:t>(e.g., S</w:t>
+      </w:r>
+      <w:r>
+        <w:t>idman &amp;</w:t>
+      </w:r>
+      <w:r>
+        <w:t xml:space="preserve"> Tailby,</w:t>
+      </w:r>
+      <w:r>
+        <w:t xml:space="preserve"> 1982</w:t>
+      </w:r>
+      <w:r>
+        <w:t>; S</w:t>
+      </w:r>
+      <w:r>
+        <w:t>idman</w:t>
+      </w:r>
+      <w:r>
+        <w:t xml:space="preserve">, 1994) </w:t>
+      </w:r>
+      <w:r>
+        <w:t>and relational responding (e.g.,</w:t>
+      </w:r>
+      <w:r>
+        <w:t xml:space="preserve"> Steele &amp; Hayes, 1991; </w:t>
+      </w:r>
+      <w:r>
+        <w:t>…</w:t>
+      </w:r>
+      <w:r>
+        <w:t>)</w:t>
+      </w:r>
+      <w:r>
+        <w:t xml:space="preserve">, and is still used to study relational reasoning </w:t>
+      </w:r>
+      <w:r>
+        <w:t xml:space="preserve">in mainstream cognitive psychology today (e.g., Premack, </w:t>
+      </w:r>
+      <w:r>
+        <w:t>1983;</w:t>
+      </w:r>
+      <w:r>
+        <w:t xml:space="preserve"> Shivaram et al., 2026</w:t>
+      </w:r>
+      <w:r>
+        <w:t>)</w:t>
+      </w:r>
+      <w:r>
+        <w:t>.</w:t>
+      </w:r>
+      <w:r>
+        <w:t xml:space="preserve"> </w:t>
+      </w:r>
+    </w:p>
+    <w:p>
+      <w:pPr>
+        <w:pStyle w:val="APA7Body"/>
+      </w:pPr>
+      <w:r>
+        <w:t>Setting up such MTS procedures can be cumbersome, however</w:t>
+      </w:r>
+      <w:r>
+        <w:t xml:space="preserve">. Researchers have to ensure </w:t>
+      </w:r>
+      <w:r>
+        <w:t>that only one correct comparison stimulus is included on every trial</w:t>
+      </w:r>
+      <w:r>
+        <w:t xml:space="preserve"> and that participants cannot employ any </w:t>
+      </w:r>
+      <w:r>
+        <w:t>.</w:t>
       </w:r>
     </w:p>
     <w:p>
@@ -2810,7 +2978,6 @@
         <w:pStyle w:val="APA7Body"/>
       </w:pPr>
       <w:r>
-        <w:lastRenderedPageBreak/>
         <w:t>Automatically and systematically vary parameters of task and generate virtually limitless trials.</w:t>
       </w:r>
     </w:p>
@@ -2855,18 +3022,18 @@
       <w:pPr>
         <w:pStyle w:val="APA7H1"/>
       </w:pPr>
-      <w:commentRangeStart w:id="4"/>
+      <w:commentRangeStart w:id="5"/>
       <w:r>
         <w:t>Declarations</w:t>
       </w:r>
-      <w:commentRangeEnd w:id="4"/>
+      <w:commentRangeEnd w:id="5"/>
       <w:r>
         <w:rPr>
           <w:rStyle w:val="CommentReference"/>
           <w:sz w:val="24"/>
           <w:szCs w:val="36"/>
         </w:rPr>
-        <w:commentReference w:id="4"/>
+        <w:commentReference w:id="5"/>
       </w:r>
     </w:p>
     <w:p>
@@ -2926,6 +3093,7 @@
         <w:rPr>
           <w:b/>
         </w:rPr>
+        <w:lastRenderedPageBreak/>
         <w:t>Ethics approval</w:t>
       </w:r>
       <w:r>
@@ -3317,7 +3485,26 @@
       </w:r>
     </w:p>
   </w:comment>
-  <w:comment w:id="4" w:author="Matthias Raemaekers" w:date="2024-11-17T12:02:00Z" w:initials="MR">
+  <w:comment w:id="4" w:author="Matthias Raemaekers" w:date="2026-05-26T17:59:00Z" w:initials="MR">
+    <w:p>
+      <w:pPr>
+        <w:pStyle w:val="CommentText"/>
+      </w:pPr>
+      <w:r>
+        <w:rPr>
+          <w:rStyle w:val="CommentReference"/>
+        </w:rPr>
+        <w:annotationRef/>
+      </w:r>
+      <w:r>
+        <w:rPr>
+          <w:lang w:val="nl-BE"/>
+        </w:rPr>
+        <w:t>Now added plot settings and stimulus layout (need to test still).</w:t>
+      </w:r>
+    </w:p>
+  </w:comment>
+  <w:comment w:id="5" w:author="Matthias Raemaekers" w:date="2024-11-17T12:02:00Z" w:initials="MR">
     <w:p>
       <w:pPr>
         <w:pStyle w:val="CommentText"/>
@@ -3342,6 +3529,7 @@
   <w15:commentEx w15:paraId="2F662FA5" w15:done="0"/>
   <w15:commentEx w15:paraId="22554633" w15:done="0"/>
   <w15:commentEx w15:paraId="4D1D521A" w15:done="0"/>
+  <w15:commentEx w15:paraId="3EE5BF6B" w15:done="0"/>
   <w15:commentEx w15:paraId="4AF4B946" w15:done="0"/>
 </w15:commentsEx>
 </file>
@@ -3352,6 +3540,7 @@
   <w16cex:commentExtensible w16cex:durableId="5216E95F" w16cex:dateUtc="2024-11-17T11:08:00Z"/>
   <w16cex:commentExtensible w16cex:durableId="62F709F2" w16cex:dateUtc="2026-05-26T08:32:00Z"/>
   <w16cex:commentExtensible w16cex:durableId="60120697" w16cex:dateUtc="2025-11-06T12:42:00Z"/>
+  <w16cex:commentExtensible w16cex:durableId="231ACC3B" w16cex:dateUtc="2026-05-26T15:59:00Z"/>
   <w16cex:commentExtensible w16cex:durableId="0BC55A2E" w16cex:dateUtc="2024-11-17T11:02:00Z"/>
 </w16cex:commentsExtensible>
 </file>
@@ -3362,6 +3551,7 @@
   <w16cid:commentId w16cid:paraId="2F662FA5" w16cid:durableId="5216E95F"/>
   <w16cid:commentId w16cid:paraId="22554633" w16cid:durableId="62F709F2"/>
   <w16cid:commentId w16cid:paraId="4D1D521A" w16cid:durableId="60120697"/>
+  <w16cid:commentId w16cid:paraId="3EE5BF6B" w16cid:durableId="231ACC3B"/>
   <w16cid:commentId w16cid:paraId="4AF4B946" w16cid:durableId="0BC55A2E"/>
 </w16cid:commentsIds>
 </file>

</xml_diff>

<commit_message>
Updated manuscript + MTS app
</commit_message>
<xml_diff>
--- a/Manuscript_BRM/Manuscript_OpenSourceRelationalNetworkDerivationVisualizationTaskGeneration.docx
+++ b/Manuscript_BRM/Manuscript_OpenSourceRelationalNetworkDerivationVisualizationTaskGeneration.docx
@@ -2397,6 +2397,133 @@
       <w:r>
         <w:t xml:space="preserve"> script. </w:t>
       </w:r>
+      <w:r>
+        <w:t>T</w:t>
+      </w:r>
+      <w:r>
+        <w:t>he deriveRelationsFromBaseline function was developed to compute the relational entailments implied by a user-specified set of baseline relations</w:t>
+      </w:r>
+      <w:r>
+        <w:t>. T</w:t>
+      </w:r>
+      <w:r>
+        <w:t>he function takes as input a dictionary of trained or otherwise specified baseline relations, where each key is a relation label and each value is a list of ordered stimulus pairs instantiating that relation</w:t>
+      </w:r>
+      <w:r>
+        <w:t xml:space="preserve">. </w:t>
+      </w:r>
+      <w:r>
+        <w:t>The function first standardizes the supplied relation labels and constructs the derivation tables for the relation set contained in the baseline network.</w:t>
+      </w:r>
+      <w:r>
+        <w:t xml:space="preserve"> </w:t>
+      </w:r>
+      <w:r>
+        <w:t>T</w:t>
+      </w:r>
+      <w:r>
+        <w:t>he function loops through each baseline relation and each instance of that relation. For every baseline relation between two stimuli, the function first derives the corresponding mutually entailed relation by reversing the order of the stimulus pair and assigning the label</w:t>
+      </w:r>
+      <w:r>
+        <w:t xml:space="preserve"> of the mutually entailed relation (as per derivation tables)</w:t>
+      </w:r>
+      <w:r>
+        <w:t xml:space="preserve">. </w:t>
+      </w:r>
+      <w:r>
+        <w:t>For instance</w:t>
+      </w:r>
+      <w:r>
+        <w:t xml:space="preserve">, if the baseline network contains the relation </w:t>
+      </w:r>
+      <w:r>
+        <w:t>‘</w:t>
+      </w:r>
+      <w:r>
+        <w:t>A more than B</w:t>
+      </w:r>
+      <w:r>
+        <w:t>’</w:t>
+      </w:r>
+      <w:r>
+        <w:t xml:space="preserve">, the function adds the derived relation </w:t>
+      </w:r>
+      <w:r>
+        <w:t>‘</w:t>
+      </w:r>
+      <w:r>
+        <w:t>B less than A</w:t>
+      </w:r>
+      <w:r>
+        <w:t>’</w:t>
+      </w:r>
+      <w:r>
+        <w:t xml:space="preserve">. </w:t>
+      </w:r>
+      <w:r>
+        <w:t>The function then evaluates possible combinatorial entailments by comparing each baseline relation instance with every other baseline relation instance. For each pair of baseline relations, it identifies whether the two relations share a common stimulus. If no common stimulus is present, no combinatorial relation can be derived from that pair. If a common stimulus is present, the function determines the structural protocol defined by the two relations</w:t>
+      </w:r>
+      <w:r>
+        <w:t xml:space="preserve"> (i.e., linear, reversed linear, one-to-many or many-to-one)</w:t>
+      </w:r>
+      <w:r>
+        <w:t xml:space="preserve">, which </w:t>
+      </w:r>
+      <w:r>
+        <w:t>determines which relation can be derived (between which stimuli)</w:t>
+      </w:r>
+      <w:r>
+        <w:t>.</w:t>
+      </w:r>
+      <w:r>
+        <w:t xml:space="preserve"> </w:t>
+      </w:r>
+      <w:r>
+        <w:t>If the</w:t>
+      </w:r>
+      <w:r>
+        <w:t xml:space="preserve"> combinatorial entailment derivation</w:t>
+      </w:r>
+      <w:r>
+        <w:t xml:space="preserve"> table specifies a valid derived relation, the function adds this relation to the derived-relation dictionary. It also adds the mutually entailed counterpart of that combinatorially entailed relation.</w:t>
+      </w:r>
+      <w:r>
+        <w:t xml:space="preserve"> Finally, the function supports optional illustration</w:t>
+      </w:r>
+      <w:r>
+        <w:t xml:space="preserve"> modes</w:t>
+      </w:r>
+      <w:r>
+        <w:t xml:space="preserve"> via the ‘illustration’ argument; when set to ‘print’, the function will print out the reasoning steps to become the derived relations; when set to heatmap, function will </w:t>
+      </w:r>
+      <w:r>
+        <w:t xml:space="preserve">generate </w:t>
+      </w:r>
+      <w:r>
+        <w:t>stimulus-by-stimulus heatmaps of the baseline and derived relations</w:t>
+      </w:r>
+      <w:r>
+        <w:t>; when ‘graph’ is selec</w:t>
+      </w:r>
+      <w:r>
+        <w:t>t</w:t>
+      </w:r>
+      <w:r>
+        <w:t xml:space="preserve">ed, </w:t>
+      </w:r>
+      <w:r>
+        <w:t xml:space="preserve">the baseline and derived relations in the network are illustrated as a directed graph network (described in more detail below). </w:t>
+      </w:r>
+      <w:r>
+        <w:t>T</w:t>
+      </w:r>
+      <w:r>
+        <w:t xml:space="preserve">he function returns </w:t>
+      </w:r>
+      <w:r>
+        <w:lastRenderedPageBreak/>
+        <w:t>both a matrix-form relation table and a dictionary of derived relations. The latter uses the same relation-label-to-stimulus-pair structure as the baseline input</w:t>
+      </w:r>
     </w:p>
     <w:p>
       <w:pPr>
@@ -2656,42 +2783,39 @@
         <w:t xml:space="preserve">developed </w:t>
       </w:r>
       <w:r>
-        <w:t xml:space="preserve">to visualize </w:t>
-      </w:r>
+        <w:t>to visualize relational networks</w:t>
+      </w:r>
+      <w:r>
+        <w:t xml:space="preserve"> as directed graphs</w:t>
+      </w:r>
+      <w:r>
+        <w:t xml:space="preserve">, </w:t>
+      </w:r>
+      <w:r>
+        <w:t xml:space="preserve">but </w:t>
+      </w:r>
+      <w:r>
+        <w:t>which also support</w:t>
+      </w:r>
+      <w:r>
+        <w:t>s</w:t>
+      </w:r>
+      <w:r>
+        <w:t xml:space="preserve"> many other relations beyond equivalence and comparison</w:t>
+      </w:r>
+      <w:r>
+        <w:t xml:space="preserve"> and offers users more flexibility</w:t>
+      </w:r>
+      <w:r>
+        <w:t>.</w:t>
+      </w:r>
+    </w:p>
+    <w:p>
+      <w:pPr>
+        <w:pStyle w:val="APA7Body"/>
+      </w:pPr>
       <w:r>
         <w:lastRenderedPageBreak/>
-        <w:t>relational networks</w:t>
-      </w:r>
-      <w:r>
-        <w:t xml:space="preserve"> as directed graphs</w:t>
-      </w:r>
-      <w:r>
-        <w:t xml:space="preserve">, </w:t>
-      </w:r>
-      <w:r>
-        <w:t xml:space="preserve">but </w:t>
-      </w:r>
-      <w:r>
-        <w:t>which also support</w:t>
-      </w:r>
-      <w:r>
-        <w:t>s</w:t>
-      </w:r>
-      <w:r>
-        <w:t xml:space="preserve"> many other relations beyond equivalence and comparison</w:t>
-      </w:r>
-      <w:r>
-        <w:t xml:space="preserve"> and offers users more flexibility</w:t>
-      </w:r>
-      <w:r>
-        <w:t>.</w:t>
-      </w:r>
-    </w:p>
-    <w:p>
-      <w:pPr>
-        <w:pStyle w:val="APA7Body"/>
-      </w:pPr>
-      <w:r>
         <w:t>The</w:t>
       </w:r>
       <w:r>
@@ -2967,44 +3091,267 @@
       <w:r>
         <w:t xml:space="preserve"> </w:t>
       </w:r>
-    </w:p>
-    <w:p>
-      <w:pPr>
-        <w:pStyle w:val="APA7Body"/>
-      </w:pPr>
-      <w:r>
-        <w:t xml:space="preserve">The app requires users to first specify the </w:t>
-      </w:r>
-      <w:r>
-        <w:t>number of stimuli that make up the network (with labels) and the relations involved in the network</w:t>
+      <w:r>
+        <w:t xml:space="preserve">The app interface presents some basic information and instructions centrally, and provides a sidebar where users can specify the relational network and plot settings. </w:t>
+      </w:r>
+      <w:r>
+        <w:t xml:space="preserve">Users are first required </w:t>
+      </w:r>
+      <w:r>
+        <w:t xml:space="preserve">to specify the </w:t>
+      </w:r>
+      <w:r>
+        <w:t xml:space="preserve">number of stimuli that make up the network (with </w:t>
+      </w:r>
+      <w:r>
+        <w:t xml:space="preserve">accompanying </w:t>
+      </w:r>
+      <w:r>
+        <w:t>labels) and the relation</w:t>
+      </w:r>
+      <w:r>
+        <w:t xml:space="preserve"> types</w:t>
+      </w:r>
+      <w:r>
+        <w:t xml:space="preserve"> involved in the network</w:t>
       </w:r>
       <w:r>
         <w:t xml:space="preserve"> (e.g., same, different, opposite to, more than, etc.)</w:t>
       </w:r>
       <w:r>
-        <w:t xml:space="preserve">. </w:t>
-      </w:r>
-      <w:r>
-        <w:t xml:space="preserve">Once these requirements are met, users can move on to specifying the baseline </w:t>
+        <w:t>.</w:t>
+      </w:r>
+      <w:r>
+        <w:t xml:space="preserve"> A</w:t>
+      </w:r>
+      <w:r>
+        <w:t xml:space="preserve">fter selecting one or more relation types, users can specify how many stimulus pairs instantiate each relation and then select the source and target stimulus for each pair from dropdown menus </w:t>
+      </w:r>
+      <w:r>
+        <w:t xml:space="preserve">with </w:t>
+      </w:r>
+      <w:r>
+        <w:t>stimulus</w:t>
+      </w:r>
+      <w:r>
+        <w:t xml:space="preserve"> </w:t>
+      </w:r>
+      <w:r>
+        <w:t>label</w:t>
+      </w:r>
+      <w:r>
+        <w:t>s</w:t>
+      </w:r>
+      <w:r>
+        <w:t>.</w:t>
+      </w:r>
+      <w:r>
+        <w:t xml:space="preserve"> Users have the option to apply t</w:t>
+      </w:r>
+      <w:r>
+        <w:t>h</w:t>
+      </w:r>
+      <w:r>
+        <w:t xml:space="preserve">is </w:t>
+      </w:r>
+      <w:r>
+        <w:t xml:space="preserve">same </w:t>
       </w:r>
       <w:r>
         <w:lastRenderedPageBreak/>
-        <w:t>relational network</w:t>
-      </w:r>
-      <w:r>
-        <w:t xml:space="preserve"> by </w:t>
-      </w:r>
-      <w:r>
-        <w:t xml:space="preserve">choosing any number of instances </w:t>
-      </w:r>
-      <w:r>
-        <w:t>of each relation type (e.g., two difference</w:t>
-      </w:r>
-      <w:r>
-        <w:t xml:space="preserve"> relations and three opposition relations) and indicating the stimuli between which those relations hold.</w:t>
-      </w:r>
-      <w:r>
-        <w:t xml:space="preserve"> Optionally, users can specify a custom set of derived relations to be illustrated, if they do not want all possible derived relations to be included.</w:t>
+        <w:t xml:space="preserve">logic can to manually define derived relations, allowing </w:t>
+      </w:r>
+      <w:r>
+        <w:t>them to</w:t>
+      </w:r>
+      <w:r>
+        <w:t xml:space="preserve"> either rely on automatic derivation from the baseline network or to supply a custom derived network for visualization</w:t>
+      </w:r>
+      <w:r>
+        <w:t xml:space="preserve"> (e.g., if user wants to display only a subset of derived relations)</w:t>
+      </w:r>
+      <w:r>
+        <w:t>.</w:t>
+      </w:r>
+      <w:r>
+        <w:t xml:space="preserve"> </w:t>
+      </w:r>
+      <w:r>
+        <w:t>Users can independently control which relation</w:t>
+      </w:r>
+      <w:r>
+        <w:t xml:space="preserve">s </w:t>
+      </w:r>
+      <w:r>
+        <w:t>are displayed</w:t>
+      </w:r>
+      <w:r>
+        <w:t xml:space="preserve"> (i.e., </w:t>
+      </w:r>
+      <w:r>
+        <w:t>baseline, mutually entailed,</w:t>
+      </w:r>
+      <w:r>
+        <w:t xml:space="preserve"> </w:t>
+      </w:r>
+      <w:r>
+        <w:t>and combinatorially entailed relations</w:t>
+      </w:r>
+      <w:r>
+        <w:t xml:space="preserve"> separate or combined)</w:t>
+      </w:r>
+      <w:r>
+        <w:t xml:space="preserve"> and can choose </w:t>
+      </w:r>
+      <w:r>
+        <w:t>among circular, spring, degree-based, hierarchical, and manual layouts</w:t>
+      </w:r>
+      <w:r>
+        <w:t>. Finally, u</w:t>
+      </w:r>
+      <w:r>
+        <w:t xml:space="preserve">sers can </w:t>
+      </w:r>
+      <w:r>
+        <w:t xml:space="preserve">choose a title, </w:t>
+      </w:r>
+      <w:r>
+        <w:t xml:space="preserve">select colors for baseline, mutually entailed, and combinatorially entailed </w:t>
+      </w:r>
+      <w:r>
+        <w:t xml:space="preserve">relation </w:t>
+      </w:r>
+      <w:r>
+        <w:t>arrows; adjust arrow curvature; modify the offset of relation labels; and set font and stimulus-marker sizes.</w:t>
+      </w:r>
+      <w:r>
+        <w:t xml:space="preserve"> Once the desired settings have been selected, users can click a button to generate the plot</w:t>
+      </w:r>
+      <w:r>
+        <w:t xml:space="preserve">, which will be directly displayed in the app and provide users an option to download </w:t>
+      </w:r>
+      <w:r>
+        <w:t xml:space="preserve">it as </w:t>
+      </w:r>
+      <w:r>
+        <w:t>a png</w:t>
+      </w:r>
+      <w:r>
+        <w:t>-file</w:t>
+      </w:r>
+      <w:r>
+        <w:t>.</w:t>
+      </w:r>
+    </w:p>
+    <w:p>
+      <w:pPr>
+        <w:pStyle w:val="APA7H3"/>
+      </w:pPr>
+      <w:r>
+        <w:t>Match</w:t>
+      </w:r>
+      <w:r>
+        <w:t>ing</w:t>
+      </w:r>
+      <w:r>
+        <w:t xml:space="preserve">-to-Sample </w:t>
+      </w:r>
+      <w:r>
+        <w:t>Procedure Generator</w:t>
+      </w:r>
+    </w:p>
+    <w:p>
+      <w:pPr>
+        <w:pStyle w:val="APA7Body"/>
+      </w:pPr>
+      <w:r>
+        <w:t xml:space="preserve">The second tool we present in this manuscript </w:t>
+      </w:r>
+      <w:r>
+        <w:t xml:space="preserve">allows users to generate matching-to-sample procedures. </w:t>
+      </w:r>
+      <w:r>
+        <w:t xml:space="preserve">MTS procedures have long been used in </w:t>
+      </w:r>
+      <w:r>
+        <w:t xml:space="preserve">behavior-analytic research to study </w:t>
+      </w:r>
+      <w:r>
+        <w:t xml:space="preserve">stimulus equivalence </w:t>
+      </w:r>
+      <w:r>
+        <w:t>(e.g., S</w:t>
+      </w:r>
+      <w:r>
+        <w:t>idman &amp;</w:t>
+      </w:r>
+      <w:r>
+        <w:t xml:space="preserve"> Tailby,</w:t>
+      </w:r>
+      <w:r>
+        <w:t xml:space="preserve"> 1982</w:t>
+      </w:r>
+      <w:r>
+        <w:t>; S</w:t>
+      </w:r>
+      <w:r>
+        <w:t>idman</w:t>
+      </w:r>
+      <w:r>
+        <w:t xml:space="preserve">, 1994) </w:t>
+      </w:r>
+      <w:r>
+        <w:t>and relational responding (e.g.,</w:t>
+      </w:r>
+      <w:r>
+        <w:t xml:space="preserve"> Steele &amp; Hayes, 1991; </w:t>
+      </w:r>
+      <w:r>
+        <w:t>…</w:t>
+      </w:r>
+      <w:r>
+        <w:t>)</w:t>
+      </w:r>
+      <w:r>
+        <w:t xml:space="preserve">, and is still used to study relational reasoning </w:t>
+      </w:r>
+      <w:r>
+        <w:t xml:space="preserve">in mainstream cognitive psychology today (e.g., Premack, </w:t>
+      </w:r>
+      <w:r>
+        <w:t>1983;</w:t>
+      </w:r>
+      <w:r>
+        <w:t xml:space="preserve"> Shivaram et al., 2026</w:t>
+      </w:r>
+      <w:r>
+        <w:t>)</w:t>
+      </w:r>
+      <w:r>
+        <w:t>.</w:t>
+      </w:r>
+      <w:r>
+        <w:t xml:space="preserve"> </w:t>
+      </w:r>
+    </w:p>
+    <w:p>
+      <w:pPr>
+        <w:pStyle w:val="APA7Body"/>
+      </w:pPr>
+      <w:r>
+        <w:t>Setting up such MTS procedures can be cumbersome, however</w:t>
+      </w:r>
+      <w:r>
+        <w:t xml:space="preserve">. Researchers have to ensure </w:t>
+      </w:r>
+      <w:r>
+        <w:t>that only one correct comparison stimulus is included on every trial</w:t>
+      </w:r>
+      <w:r>
+        <w:t xml:space="preserve"> and that participants cannot employ any </w:t>
+      </w:r>
+      <w:r>
+        <w:t>.</w:t>
       </w:r>
     </w:p>
     <w:p>
@@ -3016,130 +3363,10 @@
         </w:numPr>
       </w:pPr>
       <w:r>
-        <w:t>Tool for now can handle (all? combinations of) same, different, opposite, more than, less than, before, after, contains, is part of/during (but</w:t>
-      </w:r>
-      <w:r>
-        <w:t xml:space="preserve"> many relations share pattern of comparative relations in that they are similarly asymmetrical, e.g., father-son)</w:t>
-      </w:r>
-      <w:r>
-        <w:t>.</w:t>
-      </w:r>
-    </w:p>
-    <w:p>
-      <w:pPr>
-        <w:pStyle w:val="APA7Body"/>
-        <w:ind w:firstLine="0"/>
-      </w:pPr>
-    </w:p>
-    <w:p>
-      <w:pPr>
-        <w:pStyle w:val="APA7H3"/>
-      </w:pPr>
-      <w:r>
-        <w:t>Match</w:t>
-      </w:r>
-      <w:r>
-        <w:t>ing</w:t>
-      </w:r>
-      <w:r>
-        <w:t xml:space="preserve">-to-Sample </w:t>
-      </w:r>
-      <w:r>
-        <w:t>Procedure Generator</w:t>
-      </w:r>
-    </w:p>
-    <w:p>
-      <w:pPr>
-        <w:pStyle w:val="APA7Body"/>
-      </w:pPr>
-      <w:r>
-        <w:t xml:space="preserve">The second tool we present in this manuscript </w:t>
-      </w:r>
-      <w:r>
-        <w:t xml:space="preserve">allows users to generate matching-to-sample procedures. </w:t>
-      </w:r>
-      <w:r>
-        <w:t xml:space="preserve">MTS procedures have long been used in </w:t>
-      </w:r>
-      <w:r>
-        <w:t xml:space="preserve">behavior-analytic research to study </w:t>
-      </w:r>
-      <w:r>
-        <w:t xml:space="preserve">stimulus equivalence </w:t>
-      </w:r>
-      <w:r>
-        <w:t>(e.g., S</w:t>
-      </w:r>
-      <w:r>
-        <w:t>idman &amp;</w:t>
-      </w:r>
-      <w:r>
-        <w:t xml:space="preserve"> Tailby,</w:t>
-      </w:r>
-      <w:r>
-        <w:t xml:space="preserve"> 1982</w:t>
-      </w:r>
-      <w:r>
-        <w:t>; S</w:t>
-      </w:r>
-      <w:r>
-        <w:t>idman</w:t>
-      </w:r>
-      <w:r>
-        <w:t xml:space="preserve">, 1994) </w:t>
-      </w:r>
-      <w:r>
-        <w:t>and relational responding (e.g.,</w:t>
-      </w:r>
-      <w:r>
-        <w:t xml:space="preserve"> Steele &amp; Hayes, 1991; </w:t>
-      </w:r>
-      <w:r>
-        <w:t>…</w:t>
-      </w:r>
-      <w:r>
-        <w:t>)</w:t>
-      </w:r>
-      <w:r>
-        <w:t xml:space="preserve">, and is still used to study relational reasoning </w:t>
-      </w:r>
-      <w:r>
-        <w:t xml:space="preserve">in mainstream cognitive psychology today (e.g., Premack, </w:t>
-      </w:r>
-      <w:r>
-        <w:t>1983;</w:t>
-      </w:r>
-      <w:r>
-        <w:t xml:space="preserve"> Shivaram et al., 2026</w:t>
-      </w:r>
-      <w:r>
-        <w:t>)</w:t>
-      </w:r>
-      <w:r>
-        <w:t>.</w:t>
-      </w:r>
-      <w:r>
-        <w:t xml:space="preserve"> </w:t>
-      </w:r>
-    </w:p>
-    <w:p>
-      <w:pPr>
-        <w:pStyle w:val="APA7Body"/>
-      </w:pPr>
-      <w:r>
-        <w:t>Setting up such MTS procedures can be cumbersome, however</w:t>
-      </w:r>
-      <w:r>
-        <w:t xml:space="preserve">. Researchers have to ensure </w:t>
-      </w:r>
-      <w:r>
-        <w:t>that only one correct comparison stimulus is included on every trial</w:t>
-      </w:r>
-      <w:r>
-        <w:t xml:space="preserve"> and that participants cannot employ any </w:t>
-      </w:r>
-      <w:r>
-        <w:t>.</w:t>
+        <w:t xml:space="preserve">Dominant procedure in </w:t>
+      </w:r>
+      <w:r>
+        <w:t>RFT/behavior-analytic literature</w:t>
       </w:r>
     </w:p>
     <w:p>
@@ -3151,10 +3378,7 @@
         </w:numPr>
       </w:pPr>
       <w:r>
-        <w:t xml:space="preserve">Dominant procedure in </w:t>
-      </w:r>
-      <w:r>
-        <w:t>RFT/behavior-analytic literature</w:t>
+        <w:t>Input parameters</w:t>
       </w:r>
     </w:p>
     <w:p>
@@ -3166,18 +3390,6 @@
         </w:numPr>
       </w:pPr>
       <w:r>
-        <w:t>Input parameters</w:t>
-      </w:r>
-    </w:p>
-    <w:p>
-      <w:pPr>
-        <w:pStyle w:val="APA7Body"/>
-        <w:numPr>
-          <w:ilvl w:val="0"/>
-          <w:numId w:val="5"/>
-        </w:numPr>
-      </w:pPr>
-      <w:r>
         <w:t>Examp</w:t>
       </w:r>
       <w:r>
@@ -3217,6 +3429,7 @@
         <w:pStyle w:val="APA7Body"/>
       </w:pPr>
       <w:r>
+        <w:lastRenderedPageBreak/>
         <w:t>Automatically and systematically vary parameters of task and generate virtually limitless trials.</w:t>
       </w:r>
     </w:p>
@@ -3225,7 +3438,6 @@
         <w:pStyle w:val="APA7H2"/>
       </w:pPr>
       <w:r>
-        <w:lastRenderedPageBreak/>
         <w:t>Discussion</w:t>
       </w:r>
     </w:p>
@@ -3562,7 +3774,6 @@
         <w:pStyle w:val="APA7H1"/>
       </w:pPr>
       <w:r>
-        <w:lastRenderedPageBreak/>
         <w:t>References</w:t>
       </w:r>
     </w:p>

</xml_diff>

<commit_message>
Added explainers to visualizer
</commit_message>
<xml_diff>
--- a/Manuscript_BRM/Manuscript_OpenSourceRelationalNetworkDerivationVisualizationTaskGeneration.docx
+++ b/Manuscript_BRM/Manuscript_OpenSourceRelationalNetworkDerivationVisualizationTaskGeneration.docx
@@ -8889,8 +8889,6 @@
           <w:bCs w:val="0"/>
         </w:rPr>
       </w:pPr>
-      <w:commentRangeStart w:id="64"/>
-      <w:commentRangeStart w:id="65"/>
       <w:r>
         <w:rPr>
           <w:b/>
@@ -8898,28 +8896,6 @@
         </w:rPr>
         <w:t>Figure 2</w:t>
       </w:r>
-      <w:commentRangeEnd w:id="64"/>
-      <w:r>
-        <w:rPr>
-          <w:rStyle w:val="CommentReference"/>
-          <w:b/>
-          <w:bCs w:val="0"/>
-          <w:sz w:val="24"/>
-          <w:szCs w:val="36"/>
-        </w:rPr>
-        <w:commentReference w:id="64"/>
-      </w:r>
-      <w:commentRangeEnd w:id="65"/>
-      <w:r>
-        <w:rPr>
-          <w:rStyle w:val="CommentReference"/>
-          <w:b/>
-          <w:bCs w:val="0"/>
-          <w:sz w:val="24"/>
-          <w:szCs w:val="36"/>
-        </w:rPr>
-        <w:commentReference w:id="65"/>
-      </w:r>
     </w:p>
     <w:p>
       <w:pPr>
@@ -8943,102 +8919,110 @@
         <w:pStyle w:val="APA7Body"/>
         <w:ind w:firstLine="0"/>
       </w:pPr>
-      <w:r>
-        <w:rPr>
-          <w:noProof/>
-        </w:rPr>
-        <w:drawing>
-          <wp:inline distT="0" distB="0" distL="0" distR="0" wp14:anchorId="5AB2B125" wp14:editId="7D0C31FA">
-            <wp:extent cx="2908703" cy="3039533"/>
-            <wp:effectExtent l="0" t="0" r="6350" b="8890"/>
-            <wp:docPr id="1677887747" name="Picture 2"/>
-            <wp:cNvGraphicFramePr>
-              <a:graphicFrameLocks xmlns:a="http://schemas.openxmlformats.org/drawingml/2006/main" noChangeAspect="1"/>
-            </wp:cNvGraphicFramePr>
-            <a:graphic xmlns:a="http://schemas.openxmlformats.org/drawingml/2006/main">
-              <a:graphicData uri="http://schemas.openxmlformats.org/drawingml/2006/picture">
-                <pic:pic xmlns:pic="http://schemas.openxmlformats.org/drawingml/2006/picture">
-                  <pic:nvPicPr>
-                    <pic:cNvPr id="1677887747" name="Picture 1677887747"/>
-                    <pic:cNvPicPr/>
-                  </pic:nvPicPr>
-                  <pic:blipFill>
-                    <a:blip r:embed="rId16" cstate="print">
-                      <a:extLst>
-                        <a:ext uri="{28A0092B-C50C-407E-A947-70E740481C1C}">
-                          <a14:useLocalDpi xmlns:a14="http://schemas.microsoft.com/office/drawing/2010/main" val="0"/>
-                        </a:ext>
-                      </a:extLst>
-                    </a:blip>
-                    <a:stretch>
-                      <a:fillRect/>
-                    </a:stretch>
-                  </pic:blipFill>
-                  <pic:spPr>
-                    <a:xfrm>
-                      <a:off x="0" y="0"/>
-                      <a:ext cx="2923948" cy="3055464"/>
-                    </a:xfrm>
-                    <a:prstGeom prst="rect">
-                      <a:avLst/>
-                    </a:prstGeom>
-                  </pic:spPr>
-                </pic:pic>
-              </a:graphicData>
-            </a:graphic>
-          </wp:inline>
-        </w:drawing>
-      </w:r>
-      <w:r>
-        <w:rPr>
-          <w:noProof/>
-        </w:rPr>
-        <w:drawing>
-          <wp:inline distT="0" distB="0" distL="0" distR="0" wp14:anchorId="6CBF07D6" wp14:editId="492C31CA">
-            <wp:extent cx="2911686" cy="3042648"/>
-            <wp:effectExtent l="0" t="0" r="3175" b="5715"/>
-            <wp:docPr id="1733443246" name="Picture 3"/>
-            <wp:cNvGraphicFramePr>
-              <a:graphicFrameLocks xmlns:a="http://schemas.openxmlformats.org/drawingml/2006/main" noChangeAspect="1"/>
-            </wp:cNvGraphicFramePr>
-            <a:graphic xmlns:a="http://schemas.openxmlformats.org/drawingml/2006/main">
-              <a:graphicData uri="http://schemas.openxmlformats.org/drawingml/2006/picture">
-                <pic:pic xmlns:pic="http://schemas.openxmlformats.org/drawingml/2006/picture">
-                  <pic:nvPicPr>
-                    <pic:cNvPr id="1733443246" name="Picture 1733443246"/>
-                    <pic:cNvPicPr/>
-                  </pic:nvPicPr>
-                  <pic:blipFill>
-                    <a:blip r:embed="rId17" cstate="print">
-                      <a:extLst>
-                        <a:ext uri="{28A0092B-C50C-407E-A947-70E740481C1C}">
-                          <a14:useLocalDpi xmlns:a14="http://schemas.microsoft.com/office/drawing/2010/main" val="0"/>
-                        </a:ext>
-                      </a:extLst>
-                    </a:blip>
-                    <a:stretch>
-                      <a:fillRect/>
-                    </a:stretch>
-                  </pic:blipFill>
-                  <pic:spPr>
-                    <a:xfrm>
-                      <a:off x="0" y="0"/>
-                      <a:ext cx="2928307" cy="3060016"/>
-                    </a:xfrm>
-                    <a:prstGeom prst="rect">
-                      <a:avLst/>
-                    </a:prstGeom>
-                  </pic:spPr>
-                </pic:pic>
-              </a:graphicData>
-            </a:graphic>
-          </wp:inline>
-        </w:drawing>
-      </w:r>
+      <w:ins w:id="64" w:author="Matthias Raemaekers" w:date="2026-09-28T11:29:00Z" w16du:dateUtc="2026-09-28T09:29:00Z">
+        <w:r>
+          <w:rPr>
+            <w:noProof/>
+          </w:rPr>
+          <w:drawing>
+            <wp:inline distT="0" distB="0" distL="0" distR="0" wp14:anchorId="289C074D" wp14:editId="434F1157">
+              <wp:extent cx="2910840" cy="3041765"/>
+              <wp:effectExtent l="0" t="0" r="3810" b="6350"/>
+              <wp:docPr id="1921283461" name="Picture 2"/>
+              <wp:cNvGraphicFramePr>
+                <a:graphicFrameLocks xmlns:a="http://schemas.openxmlformats.org/drawingml/2006/main" noChangeAspect="1"/>
+              </wp:cNvGraphicFramePr>
+              <a:graphic xmlns:a="http://schemas.openxmlformats.org/drawingml/2006/main">
+                <a:graphicData uri="http://schemas.openxmlformats.org/drawingml/2006/picture">
+                  <pic:pic xmlns:pic="http://schemas.openxmlformats.org/drawingml/2006/picture">
+                    <pic:nvPicPr>
+                      <pic:cNvPr id="1921283461" name="Picture 1921283461"/>
+                      <pic:cNvPicPr/>
+                    </pic:nvPicPr>
+                    <pic:blipFill>
+                      <a:blip r:embed="rId16" cstate="print">
+                        <a:extLst>
+                          <a:ext uri="{28A0092B-C50C-407E-A947-70E740481C1C}">
+                            <a14:useLocalDpi xmlns:a14="http://schemas.microsoft.com/office/drawing/2010/main" val="0"/>
+                          </a:ext>
+                        </a:extLst>
+                      </a:blip>
+                      <a:stretch>
+                        <a:fillRect/>
+                      </a:stretch>
+                    </pic:blipFill>
+                    <pic:spPr>
+                      <a:xfrm>
+                        <a:off x="0" y="0"/>
+                        <a:ext cx="2931046" cy="3062880"/>
+                      </a:xfrm>
+                      <a:prstGeom prst="rect">
+                        <a:avLst/>
+                      </a:prstGeom>
+                    </pic:spPr>
+                  </pic:pic>
+                </a:graphicData>
+              </a:graphic>
+            </wp:inline>
+          </w:drawing>
+        </w:r>
+        <w:r>
+          <w:rPr>
+            <w:noProof/>
+          </w:rPr>
+          <w:drawing>
+            <wp:inline distT="0" distB="0" distL="0" distR="0" wp14:anchorId="64CD2C30" wp14:editId="20499E6A">
+              <wp:extent cx="2909822" cy="3040701"/>
+              <wp:effectExtent l="0" t="0" r="5080" b="7620"/>
+              <wp:docPr id="588931360" name="Picture 1"/>
+              <wp:cNvGraphicFramePr>
+                <a:graphicFrameLocks xmlns:a="http://schemas.openxmlformats.org/drawingml/2006/main" noChangeAspect="1"/>
+              </wp:cNvGraphicFramePr>
+              <a:graphic xmlns:a="http://schemas.openxmlformats.org/drawingml/2006/main">
+                <a:graphicData uri="http://schemas.openxmlformats.org/drawingml/2006/picture">
+                  <pic:pic xmlns:pic="http://schemas.openxmlformats.org/drawingml/2006/picture">
+                    <pic:nvPicPr>
+                      <pic:cNvPr id="588931360" name="Picture 588931360"/>
+                      <pic:cNvPicPr/>
+                    </pic:nvPicPr>
+                    <pic:blipFill>
+                      <a:blip r:embed="rId17" cstate="print">
+                        <a:extLst>
+                          <a:ext uri="{28A0092B-C50C-407E-A947-70E740481C1C}">
+                            <a14:useLocalDpi xmlns:a14="http://schemas.microsoft.com/office/drawing/2010/main" val="0"/>
+                          </a:ext>
+                        </a:extLst>
+                      </a:blip>
+                      <a:stretch>
+                        <a:fillRect/>
+                      </a:stretch>
+                    </pic:blipFill>
+                    <pic:spPr>
+                      <a:xfrm>
+                        <a:off x="0" y="0"/>
+                        <a:ext cx="2928816" cy="3060549"/>
+                      </a:xfrm>
+                      <a:prstGeom prst="rect">
+                        <a:avLst/>
+                      </a:prstGeom>
+                    </pic:spPr>
+                  </pic:pic>
+                </a:graphicData>
+              </a:graphic>
+            </wp:inline>
+          </w:drawing>
+        </w:r>
+      </w:ins>
     </w:p>
     <w:p>
       <w:pPr>
         <w:pStyle w:val="APA7Body"/>
+        <w:ind w:firstLine="0"/>
+        <w:pPrChange w:id="65" w:author="Matthias Raemaekers" w:date="2026-09-28T11:36:00Z" w16du:dateUtc="2026-09-28T09:36:00Z">
+          <w:pPr>
+            <w:pStyle w:val="APA7Body"/>
+          </w:pPr>
+        </w:pPrChange>
       </w:pPr>
       <w:r>
         <w:t>To generate a MTS procedure we turn to the MTS generator app.</w:t>
@@ -9065,23 +9049,279 @@
         <w:t xml:space="preserve">one and number of comparison stimuli to three. This should generate a trial set of sixty training trials (ten iterations of the six baseline relations) and </w:t>
       </w:r>
       <w:r>
-        <w:t xml:space="preserve">twenty-four test trials (the number of novel relations that can be derived from the baseline relations). The app provides the following </w:t>
-      </w:r>
-      <w:commentRangeStart w:id="66"/>
+        <w:t>twenty</w:t>
+      </w:r>
+      <w:ins w:id="66" w:author="Matthias Raemaekers" w:date="2026-09-28T11:32:00Z" w16du:dateUtc="2026-09-28T09:32:00Z">
+        <w:r>
+          <w:t>-six</w:t>
+        </w:r>
+      </w:ins>
+      <w:del w:id="67" w:author="Matthias Raemaekers" w:date="2026-09-28T11:32:00Z" w16du:dateUtc="2026-09-28T09:32:00Z">
+        <w:r>
+          <w:delText>-four</w:delText>
+        </w:r>
+      </w:del>
+      <w:r>
+        <w:t xml:space="preserve"> test trials (the number of novel relations that can be derived from the baseline relations). The app provides the following output:</w:t>
+      </w:r>
+      <w:ins w:id="68" w:author="Matthias Raemaekers" w:date="2026-09-28T11:32:00Z" w16du:dateUtc="2026-09-28T09:32:00Z">
+        <w:r>
+          <w:t xml:space="preserve"> </w:t>
+        </w:r>
+      </w:ins>
+      <w:ins w:id="69" w:author="Matthias Raemaekers" w:date="2026-09-28T11:33:00Z" w16du:dateUtc="2026-09-28T09:33:00Z">
+        <w:r>
+          <w:t xml:space="preserve">sixty baseline relations trials, six mutual entailment test trials, and twenty combinatorial entailment test trials. </w:t>
+        </w:r>
+        <w:r>
+          <w:t xml:space="preserve">It also provides an overview of the generated </w:t>
+        </w:r>
+      </w:ins>
+      <w:ins w:id="70" w:author="Matthias Raemaekers" w:date="2026-09-28T11:35:00Z" w16du:dateUtc="2026-09-28T09:35:00Z">
+        <w:r>
+          <w:t xml:space="preserve">trial </w:t>
+        </w:r>
+      </w:ins>
+      <w:ins w:id="71" w:author="Matthias Raemaekers" w:date="2026-09-28T11:33:00Z" w16du:dateUtc="2026-09-28T09:33:00Z">
+        <w:r>
+          <w:t>data</w:t>
+        </w:r>
+      </w:ins>
+      <w:ins w:id="72" w:author="Matthias Raemaekers" w:date="2026-09-28T11:35:00Z" w16du:dateUtc="2026-09-28T09:35:00Z">
+        <w:r>
+          <w:t xml:space="preserve"> </w:t>
+        </w:r>
+      </w:ins>
+      <w:ins w:id="73" w:author="Matthias Raemaekers" w:date="2026-09-28T11:33:00Z" w16du:dateUtc="2026-09-28T09:33:00Z">
+        <w:r>
+          <w:t xml:space="preserve">(with fields </w:t>
+        </w:r>
+      </w:ins>
+      <w:ins w:id="74" w:author="Matthias Raemaekers" w:date="2026-09-28T11:34:00Z" w16du:dateUtc="2026-09-28T09:34:00Z">
+        <w:r>
+          <w:t xml:space="preserve">trial index, </w:t>
+        </w:r>
+      </w:ins>
+      <w:ins w:id="75" w:author="Matthias Raemaekers" w:date="2026-09-28T11:33:00Z" w16du:dateUtc="2026-09-28T09:33:00Z">
+        <w:r>
+          <w:t>cue, sample</w:t>
+        </w:r>
+      </w:ins>
+      <w:ins w:id="76" w:author="Matthias Raemaekers" w:date="2026-09-28T11:34:00Z" w16du:dateUtc="2026-09-28T09:34:00Z">
+        <w:r>
+          <w:t xml:space="preserve"> stimulus, comparison stimulus, correct response,</w:t>
+        </w:r>
+        <w:r>
+          <w:t xml:space="preserve"> and labels</w:t>
+        </w:r>
+        <w:r>
+          <w:t>)</w:t>
+        </w:r>
+      </w:ins>
+      <w:ins w:id="77" w:author="Matthias Raemaekers" w:date="2026-09-28T11:35:00Z" w16du:dateUtc="2026-09-28T09:35:00Z">
+        <w:r>
+          <w:t>, an example trial,</w:t>
+        </w:r>
+      </w:ins>
+      <w:ins w:id="78" w:author="Matthias Raemaekers" w:date="2026-09-28T11:34:00Z" w16du:dateUtc="2026-09-28T09:34:00Z">
+        <w:r>
+          <w:t xml:space="preserve"> and allows users to download the </w:t>
+        </w:r>
+      </w:ins>
+      <w:ins w:id="79" w:author="Matthias Raemaekers" w:date="2026-09-28T11:35:00Z" w16du:dateUtc="2026-09-28T09:35:00Z">
+        <w:r>
+          <w:t xml:space="preserve">trial </w:t>
+        </w:r>
+      </w:ins>
+      <w:ins w:id="80" w:author="Matthias Raemaekers" w:date="2026-09-28T11:34:00Z" w16du:dateUtc="2026-09-28T09:34:00Z">
+        <w:r>
+          <w:t>data</w:t>
+        </w:r>
+      </w:ins>
+      <w:ins w:id="81" w:author="Matthias Raemaekers" w:date="2026-09-28T11:35:00Z" w16du:dateUtc="2026-09-28T09:35:00Z">
+        <w:r>
+          <w:t xml:space="preserve"> </w:t>
+        </w:r>
+      </w:ins>
+      <w:ins w:id="82" w:author="Matthias Raemaekers" w:date="2026-09-28T11:34:00Z" w16du:dateUtc="2026-09-28T09:34:00Z">
+        <w:r>
+          <w:t xml:space="preserve">as a csv-file. </w:t>
+        </w:r>
+      </w:ins>
+      <w:r>
+        <w:lastRenderedPageBreak/>
+        <w:t xml:space="preserve">The csv output can then be used in experimental software like Psychopy, Labjs or </w:t>
+      </w:r>
+      <w:r>
+        <w:t>JPsych to administer the procedure to participants.</w:t>
+      </w:r>
+    </w:p>
+    <w:p>
+      <w:pPr>
+        <w:pStyle w:val="APA7H3"/>
+      </w:pPr>
+      <w:r>
+        <w:t xml:space="preserve">Tutorial 2 </w:t>
+      </w:r>
+      <w:r>
+        <w:t>–</w:t>
+      </w:r>
+      <w:r>
+        <w:t xml:space="preserve"> </w:t>
+      </w:r>
+      <w:r>
+        <w:t>Syllogistic Reasoning Task</w:t>
+      </w:r>
+    </w:p>
+    <w:p>
+      <w:pPr>
+        <w:pStyle w:val="APA7Body"/>
+      </w:pPr>
+      <w:r>
+        <w:t>To illustrate the syllogistic reasoning problem generator, imag</w:t>
+      </w:r>
+      <w:r>
+        <w:t>in</w:t>
+      </w:r>
+      <w:r>
+        <w:t xml:space="preserve">e a researcher who wants to create what is often referred to as </w:t>
+      </w:r>
+      <w:r>
+        <w:t xml:space="preserve">an </w:t>
+      </w:r>
+      <w:r>
+        <w:t>n-term</w:t>
+      </w:r>
+      <w:r>
+        <w:t xml:space="preserve"> (relational)</w:t>
+      </w:r>
+      <w:r>
+        <w:t xml:space="preserve"> reasoning task in </w:t>
+      </w:r>
+      <w:r>
+        <w:t xml:space="preserve">cognitive and </w:t>
+      </w:r>
+      <w:r>
+        <w:t>neuropsychology (e.g.,</w:t>
+      </w:r>
+      <w:r>
+        <w:t xml:space="preserve"> </w:t>
+      </w:r>
+      <w:r>
+        <w:t>Goel &amp; Dolan, 2001</w:t>
+      </w:r>
+      <w:r>
+        <w:t xml:space="preserve">). </w:t>
+      </w:r>
+      <w:r>
+        <w:t xml:space="preserve">Such tasks typically involve </w:t>
+      </w:r>
+      <w:r>
+        <w:t xml:space="preserve">syllogistic reasoning problems wherein the premises present relations between </w:t>
+      </w:r>
+      <w:r>
+        <w:rPr>
+          <w:i/>
+          <w:iCs/>
+        </w:rPr>
+        <w:t>n</w:t>
+      </w:r>
+      <w:r>
+        <w:t xml:space="preserve"> relata</w:t>
+      </w:r>
+      <w:r>
+        <w:t xml:space="preserve"> or terms</w:t>
+      </w:r>
+      <w:r>
+        <w:t>.</w:t>
+      </w:r>
+      <w:r>
+        <w:t xml:space="preserve"> </w:t>
+      </w:r>
+      <w:r>
+        <w:t xml:space="preserve">Let’s say we </w:t>
+      </w:r>
+      <w:r>
+        <w:t xml:space="preserve">are interested in studying the effect of relational complexity on </w:t>
+      </w:r>
+      <w:r>
+        <w:t xml:space="preserve">social </w:t>
+      </w:r>
+      <w:r>
+        <w:t xml:space="preserve">relational reasoning performance by increasing the number of terms </w:t>
+      </w:r>
+      <w:r>
+        <w:t xml:space="preserve">(premises) in syllogistic reasoning problems. To create a set of syllogistic reasoning problems, we use the syllogistic reasoning problem generator app. First, we specify the relations </w:t>
+      </w:r>
+      <w:r>
+        <w:t>we want to be involved in the problems</w:t>
+      </w:r>
+      <w:r>
+        <w:t xml:space="preserve"> by selecting </w:t>
+      </w:r>
+      <w:r>
+        <w:t xml:space="preserve">‘faster than’, ‘slower than’, ‘taller than’, </w:t>
+      </w:r>
+      <w:r>
+        <w:t xml:space="preserve">and </w:t>
+      </w:r>
+      <w:r>
+        <w:t>‘smaller than’</w:t>
+      </w:r>
+      <w:r>
+        <w:t xml:space="preserve"> from the drop down menu. </w:t>
+      </w:r>
+      <w:r>
+        <w:t>Then, we leave the checkbox for one-premise problems empty but check the boxes</w:t>
+      </w:r>
+      <w:r>
+        <w:t xml:space="preserve"> </w:t>
+      </w:r>
+      <w:r>
+        <w:t>for two-, three-, and four-premise problems.</w:t>
+      </w:r>
+      <w:r>
+        <w:t xml:space="preserve"> For each level of complexity, we get to select the problem variants we want to include</w:t>
+      </w:r>
+      <w:r>
+        <w:t xml:space="preserve">, and we select ‘incorrect’ (to balance yes vs. no correct responses) and ‘mutualCE’ (to test </w:t>
+      </w:r>
+      <w:r>
+        <w:t>transitive relations in both directions)</w:t>
+      </w:r>
+      <w:r>
+        <w:t>.</w:t>
+      </w:r>
+      <w:r>
+        <w:t xml:space="preserve"> </w:t>
+      </w:r>
+      <w:r>
+        <w:t>We set the number of repetitions for each unique problem to four</w:t>
+      </w:r>
+      <w:r>
+        <w:t xml:space="preserve">, the stimulus type to ‘names’ and number of response options to three to generate multiple choice problems. Finally, we do not include ill-defined problems and check the box to randomize premise order. </w:t>
+      </w:r>
+      <w:r>
+        <w:t xml:space="preserve"> </w:t>
+      </w:r>
+      <w:r>
+        <w:t xml:space="preserve">When we generate the task, the app presents the following </w:t>
+      </w:r>
+      <w:commentRangeStart w:id="83"/>
       <w:r>
         <w:t>output</w:t>
       </w:r>
-      <w:commentRangeEnd w:id="66"/>
+      <w:commentRangeEnd w:id="83"/>
       <w:r>
         <w:rPr>
           <w:rStyle w:val="CommentReference"/>
           <w:sz w:val="24"/>
           <w:szCs w:val="36"/>
         </w:rPr>
-        <w:commentReference w:id="66"/>
-      </w:r>
-      <w:r>
-        <w:t>:</w:t>
+        <w:commentReference w:id="83"/>
+      </w:r>
+      <w:r>
+        <w:t xml:space="preserve">: </w:t>
       </w:r>
     </w:p>
     <w:p>
@@ -9089,28 +9329,104 @@
         <w:pStyle w:val="APA7Body"/>
       </w:pPr>
       <w:r>
-        <w:t xml:space="preserve">The csv output can then be used in experimental software like Psychopy, Labjs or </w:t>
-      </w:r>
-      <w:r>
-        <w:t>JPsych to administer the procedure to participants.</w:t>
-      </w:r>
-    </w:p>
-    <w:p>
-      <w:pPr>
-        <w:pStyle w:val="APA7H3"/>
-      </w:pPr>
+        <w:t>The csv output can then be used in experimental software to administer the procedure to participants.</w:t>
+      </w:r>
+    </w:p>
+    <w:p>
+      <w:pPr>
+        <w:pStyle w:val="APA7H2"/>
+      </w:pPr>
+      <w:r>
+        <w:t>Discussion</w:t>
+      </w:r>
+    </w:p>
+    <w:p>
+      <w:pPr>
+        <w:pStyle w:val="APA7Body"/>
+      </w:pPr>
+      <w:r>
+        <w:t xml:space="preserve">This manuscript describes what we refer to as derivation tables </w:t>
+      </w:r>
+      <w:r>
+        <w:t>that support a python module and algorithm for automated relational derivation. This algorithm, in turn, provides the foundation for a set of tools that are intended to facilitate research on relational reasoning.</w:t>
+      </w:r>
+      <w:r>
+        <w:t xml:space="preserve"> Specifically, we described </w:t>
+      </w:r>
+      <w:r>
+        <w:t xml:space="preserve">functions to visualize relational networks as graph networks, generate MTS procedures and generate syllogistic reasoning problems, all contained in the python </w:t>
+      </w:r>
       <w:r>
         <w:lastRenderedPageBreak/>
-        <w:t xml:space="preserve">Tutorial 2 </w:t>
-      </w:r>
-      <w:r>
-        <w:t>–</w:t>
+        <w:t xml:space="preserve">module. We also described </w:t>
+      </w:r>
+      <w:r>
+        <w:t>online applications implementing the three tools in a more intuitive, code-free way, ready for researchers to use</w:t>
+      </w:r>
+      <w:r>
+        <w:t xml:space="preserve">. </w:t>
+      </w:r>
+      <w:r>
+        <w:t>The tutorials we provided illustrate their ease of use and utility.</w:t>
+      </w:r>
+    </w:p>
+    <w:p>
+      <w:pPr>
+        <w:pStyle w:val="APA7Body"/>
+      </w:pPr>
+      <w:r>
+        <w:t>While the derivation tables are limited to a set of (currently) about thirty relations</w:t>
+      </w:r>
+      <w:r>
+        <w:t>, they do provide a survey of the most commonly studied relations in psychological research</w:t>
+      </w:r>
+      <w:r>
+        <w:t xml:space="preserve"> and go beyond currently available similar tools (e.g., Smith &amp; Hayes, 2022; Carvalho et al., 2024)</w:t>
+      </w:r>
+      <w:r>
+        <w:t xml:space="preserve">. </w:t>
+      </w:r>
+      <w:r>
+        <w:t xml:space="preserve">The open-source nature of the tools invites researchers to add more relations themselves or study the generality of the underlying derivation algorithm </w:t>
+      </w:r>
+      <w:r>
+        <w:t xml:space="preserve">(i.e., </w:t>
+      </w:r>
+      <w:r>
+        <w:t>what other relations fit the same patterns of derivation currently accounted for in the algorithm)</w:t>
+      </w:r>
+      <w:r>
+        <w:t>.</w:t>
+      </w:r>
+      <w:r>
+        <w:t xml:space="preserve"> In that sense, we provide the building blocks for researchers to continue this work. </w:t>
+      </w:r>
+      <w:r>
+        <w:t>We only described three tools derived from the derivation tables and the relational derivation algorithm.</w:t>
       </w:r>
       <w:r>
         <w:t xml:space="preserve"> </w:t>
       </w:r>
       <w:r>
-        <w:t>Syllogistic Reasoning Task</w:t>
+        <w:t>W</w:t>
+      </w:r>
+      <w:r>
+        <w:t xml:space="preserve">hile we believe that </w:t>
+      </w:r>
+      <w:r>
+        <w:t xml:space="preserve">graph visualization, MTS procedures and syllogistics reasoning problems could be of use to a </w:t>
+      </w:r>
+      <w:r>
+        <w:t xml:space="preserve">broad audience of relational reasoning researchers, we could have developed many other tools as well. Again, we hope that the derivation tables and algorithm can provide researchers with the building blocks they need to build </w:t>
+      </w:r>
+      <w:r>
+        <w:t xml:space="preserve">and share </w:t>
+      </w:r>
+      <w:r>
+        <w:t xml:space="preserve">their own tools </w:t>
+      </w:r>
+      <w:r>
+        <w:t xml:space="preserve">tailored to their specific research contexts. </w:t>
       </w:r>
     </w:p>
     <w:p>
@@ -9118,59 +9434,126 @@
         <w:pStyle w:val="APA7Body"/>
       </w:pPr>
       <w:r>
-        <w:t>To illustrate the syllogistic reasoning problem generator, imag</w:t>
-      </w:r>
-      <w:r>
-        <w:t>in</w:t>
-      </w:r>
-      <w:r>
-        <w:t xml:space="preserve">e a researcher who wants to create what is often referred to as </w:t>
-      </w:r>
-      <w:r>
-        <w:t xml:space="preserve">an </w:t>
-      </w:r>
-      <w:r>
-        <w:t>n-term</w:t>
-      </w:r>
-      <w:r>
-        <w:t xml:space="preserve"> (relational)</w:t>
-      </w:r>
-      <w:r>
-        <w:t xml:space="preserve"> reasoning task in </w:t>
-      </w:r>
-      <w:r>
-        <w:t xml:space="preserve">cognitive and </w:t>
-      </w:r>
-      <w:r>
-        <w:t>neuropsychology (e.g.,</w:t>
-      </w:r>
-      <w:r>
         <w:t xml:space="preserve"> </w:t>
       </w:r>
       <w:r>
-        <w:t>Goel &amp; Dolan, 2001</w:t>
-      </w:r>
-      <w:r>
-        <w:t xml:space="preserve">). </w:t>
-      </w:r>
-      <w:r>
-        <w:t xml:space="preserve">Such tasks typically involve </w:t>
-      </w:r>
-      <w:r>
-        <w:t xml:space="preserve">syllogistic reasoning problems wherein the premises present relations between </w:t>
-      </w:r>
-      <w:r>
-        <w:rPr>
-          <w:i/>
-          <w:iCs/>
-        </w:rPr>
-        <w:t>n</w:t>
-      </w:r>
-      <w:r>
-        <w:t xml:space="preserve"> relata</w:t>
-      </w:r>
-      <w:r>
-        <w:t xml:space="preserve"> or terms</w:t>
+        <w:t xml:space="preserve">Beyond practical benefits, work like this may also inspire theoretical or conceptual insights. </w:t>
+      </w:r>
+      <w:r>
+        <w:t xml:space="preserve">In our description of the derivation tables, we noted that </w:t>
+      </w:r>
+      <w:r>
+        <w:t>some</w:t>
+      </w:r>
+      <w:r>
+        <w:t xml:space="preserve"> relations </w:t>
+      </w:r>
+      <w:r>
+        <w:t>have distinct patterns of relational derivation</w:t>
+      </w:r>
+      <w:r>
+        <w:t>, but that many relations also have identical patterns (e.g., the relations more than – less than and larger than – smaller than).</w:t>
+      </w:r>
+      <w:r>
+        <w:t xml:space="preserve"> </w:t>
+      </w:r>
+      <w:r>
+        <w:t xml:space="preserve">Studying these patterns in more detail </w:t>
+      </w:r>
+      <w:r>
+        <w:t>might offer insights into how humans acquire the ability for relational reasoning</w:t>
+      </w:r>
+      <w:r>
+        <w:t xml:space="preserve">, and how it becomes so flexible. Researchers may also </w:t>
+      </w:r>
+      <w:r>
+        <w:t>find that the patterns contradict certain theoretical predictions. For instance, in relational frame theory (</w:t>
+      </w:r>
+      <w:r>
+        <w:t xml:space="preserve">Hayes et al., 2001), </w:t>
+      </w:r>
+      <w:r>
+        <w:t>the ability to respond to different kinds of relations is described as separate so-called relational frames (i.e., coordination, distinction, opposition, comparison, hierarchy, temporal, and</w:t>
+      </w:r>
+      <w:r>
+        <w:t xml:space="preserve"> so on</w:t>
+      </w:r>
+      <w:r>
+        <w:t>)</w:t>
+      </w:r>
+      <w:r>
+        <w:t xml:space="preserve">. Closer inspection of the patterns of derivation illustrated </w:t>
+      </w:r>
+      <w:r>
+        <w:t>in Figure 1</w:t>
+      </w:r>
+      <w:r>
+        <w:t xml:space="preserve">, however, reveals that some of these relations are very similar (i.e., the relational aspect is the </w:t>
+      </w:r>
+      <w:r>
+        <w:t xml:space="preserve">same, but the psychological function that is related differs) and might rather be conceived of as different instances of the </w:t>
+      </w:r>
+      <w:r>
+        <w:lastRenderedPageBreak/>
+        <w:t>same relational frame.</w:t>
+      </w:r>
+      <w:r>
+        <w:t xml:space="preserve"> A lengthy discussion is beyond the scope of this manuscript, but the point illustrates that this work can also inspire conceptual developments.</w:t>
+      </w:r>
+      <w:r>
+        <w:br w:type="page"/>
+      </w:r>
+    </w:p>
+    <w:p>
+      <w:pPr>
+        <w:pStyle w:val="APA7H1"/>
+      </w:pPr>
+      <w:r>
+        <w:lastRenderedPageBreak/>
+        <w:t>Declarations</w:t>
+      </w:r>
+    </w:p>
+    <w:p>
+      <w:pPr>
+        <w:pStyle w:val="APA7H2"/>
+      </w:pPr>
+      <w:r>
+        <w:t>Funding</w:t>
+      </w:r>
+      <w:r>
+        <w:t xml:space="preserve"> </w:t>
+      </w:r>
+    </w:p>
+    <w:p>
+      <w:pPr>
+        <w:pStyle w:val="APA7Body"/>
+      </w:pPr>
+      <w:r>
+        <w:t xml:space="preserve">This research was </w:t>
+      </w:r>
+      <w:r>
+        <w:t>supported</w:t>
+      </w:r>
+      <w:r>
+        <w:t xml:space="preserve"> by </w:t>
+      </w:r>
+      <w:r>
+        <w:t xml:space="preserve">Flemish Research Fund fundamental research grant </w:t>
+      </w:r>
+      <w:r>
+        <w:t>11M032</w:t>
+      </w:r>
+      <w:r>
+        <w:t>5</w:t>
+      </w:r>
+      <w:r>
+        <w:t>N</w:t>
+      </w:r>
+      <w:r>
+        <w:t xml:space="preserve"> to </w:t>
+      </w:r>
+      <w:r>
+        <w:t>the first author</w:t>
       </w:r>
       <w:r>
         <w:t>.</w:t>
@@ -9179,375 +9562,167 @@
         <w:t xml:space="preserve"> </w:t>
       </w:r>
       <w:r>
-        <w:t xml:space="preserve">Let’s say we </w:t>
-      </w:r>
-      <w:r>
-        <w:t xml:space="preserve">are interested in studying the effect of relational complexity on </w:t>
-      </w:r>
-      <w:r>
-        <w:t xml:space="preserve">social </w:t>
-      </w:r>
-      <w:r>
-        <w:t xml:space="preserve">relational reasoning performance by increasing the number of terms </w:t>
-      </w:r>
-      <w:r>
-        <w:t xml:space="preserve">(premises) in syllogistic reasoning problems. To create a set of syllogistic reasoning problems, we use the syllogistic reasoning problem generator app. First, we specify the relations </w:t>
-      </w:r>
-      <w:r>
-        <w:t>we want to be involved in the problems</w:t>
-      </w:r>
-      <w:r>
-        <w:t xml:space="preserve"> by selecting </w:t>
-      </w:r>
-      <w:r>
-        <w:t xml:space="preserve">‘faster than’, ‘slower than’, ‘taller than’, </w:t>
-      </w:r>
-      <w:r>
-        <w:t xml:space="preserve">and </w:t>
-      </w:r>
-      <w:r>
-        <w:t>‘smaller than’</w:t>
-      </w:r>
-      <w:r>
-        <w:t xml:space="preserve"> from the drop down menu. </w:t>
-      </w:r>
-      <w:r>
-        <w:t>Then, we leave the checkbox for one-premise problems empty but check the boxes</w:t>
-      </w:r>
-      <w:r>
-        <w:t xml:space="preserve"> </w:t>
-      </w:r>
-      <w:r>
-        <w:t>for two-, three-, and four-premise problems.</w:t>
-      </w:r>
-      <w:r>
-        <w:t xml:space="preserve"> For each level of complexity, we get to select the problem variants we want to include</w:t>
-      </w:r>
-      <w:r>
-        <w:t xml:space="preserve">, and we select ‘incorrect’ (to balance yes vs. no correct responses) and ‘mutualCE’ (to test </w:t>
-      </w:r>
-      <w:r>
-        <w:t>transitive relations in both directions)</w:t>
-      </w:r>
-      <w:r>
-        <w:t>.</w:t>
-      </w:r>
-      <w:r>
-        <w:t xml:space="preserve"> </w:t>
-      </w:r>
-      <w:r>
-        <w:t>We set the number of repetitions for each unique problem to four</w:t>
-      </w:r>
-      <w:r>
-        <w:t xml:space="preserve">, the stimulus type to ‘names’ and number of response options to three to generate multiple choice problems. Finally, we do not include ill-defined problems and check the box to randomize premise order. </w:t>
-      </w:r>
-      <w:r>
-        <w:t xml:space="preserve"> </w:t>
-      </w:r>
-      <w:r>
-        <w:t xml:space="preserve">When we generate the task, the app presents the following </w:t>
-      </w:r>
-      <w:commentRangeStart w:id="67"/>
-      <w:r>
-        <w:t>output</w:t>
-      </w:r>
-      <w:commentRangeEnd w:id="67"/>
+        <w:t>The second author</w:t>
+      </w:r>
+      <w:r>
+        <w:t xml:space="preserve"> is supported</w:t>
+      </w:r>
+      <w:r>
+        <w:t xml:space="preserve"> Flemish Research Fund</w:t>
+      </w:r>
+      <w:r>
+        <w:t xml:space="preserve"> grant </w:t>
+      </w:r>
+      <w:r>
+        <w:rPr>
+          <w:lang w:val="en-GB"/>
+        </w:rPr>
+        <w:t>12A2B26N</w:t>
+      </w:r>
+      <w:r>
+        <w:rPr>
+          <w:lang w:val="en-GB"/>
+        </w:rPr>
+        <w:t>. The third author was supported</w:t>
+      </w:r>
+      <w:r>
+        <w:t xml:space="preserve"> by </w:t>
+      </w:r>
+      <w:r>
+        <w:t>grant BOF22/MET_V/002 - 01M00209 of Ghent University</w:t>
+      </w:r>
+      <w:r>
+        <w:t xml:space="preserve">’s. </w:t>
+      </w:r>
+    </w:p>
+    <w:p>
+      <w:pPr>
+        <w:pStyle w:val="APA7H2"/>
+      </w:pPr>
+      <w:r>
+        <w:t>Conflicts of interest/Competing interests</w:t>
+      </w:r>
+    </w:p>
+    <w:p>
+      <w:pPr>
+        <w:pStyle w:val="APA7Body"/>
+      </w:pPr>
+      <w:r>
+        <w:t>None</w:t>
+      </w:r>
+      <w:r>
+        <w:t xml:space="preserve"> to declare.</w:t>
+      </w:r>
+    </w:p>
+    <w:p>
+      <w:pPr>
+        <w:pStyle w:val="APA7Body"/>
+        <w:ind w:firstLine="0"/>
+      </w:pPr>
+      <w:r>
+        <w:rPr>
+          <w:b/>
+        </w:rPr>
+        <w:t>Ethics approval</w:t>
+      </w:r>
+      <w:r>
+        <w:rPr>
+          <w:b/>
+        </w:rPr>
+        <w:t xml:space="preserve"> and consent to participate</w:t>
+      </w:r>
+    </w:p>
+    <w:p>
+      <w:pPr>
+        <w:pStyle w:val="APA7Body"/>
+      </w:pPr>
+      <w:r>
+        <w:t>Not applicable.</w:t>
+      </w:r>
+      <w:r>
+        <w:t xml:space="preserve"> This manuscript does not report on any </w:t>
+      </w:r>
+      <w:r>
+        <w:t>research involving participants.</w:t>
+      </w:r>
+    </w:p>
+    <w:p>
+      <w:pPr>
+        <w:pStyle w:val="APA7Body"/>
+        <w:ind w:firstLine="0"/>
+      </w:pPr>
+      <w:r>
+        <w:rPr>
+          <w:b/>
+        </w:rPr>
+        <w:t>Consent for publication</w:t>
+      </w:r>
+    </w:p>
+    <w:p>
+      <w:pPr>
+        <w:pStyle w:val="APA7Body"/>
+      </w:pPr>
+      <w:r>
+        <w:t xml:space="preserve">All authors have </w:t>
+      </w:r>
+      <w:r>
+        <w:t>read</w:t>
+      </w:r>
+      <w:r>
+        <w:t xml:space="preserve"> and agree with the publication of this version of the manuscript.</w:t>
+      </w:r>
+    </w:p>
+    <w:p>
+      <w:pPr>
+        <w:pStyle w:val="APA7H2"/>
+      </w:pPr>
+      <w:r>
+        <w:t>Availability of data</w:t>
+      </w:r>
+      <w:r>
+        <w:t xml:space="preserve">, </w:t>
+      </w:r>
+      <w:r>
+        <w:t>materials</w:t>
+      </w:r>
+      <w:r>
+        <w:t xml:space="preserve"> and code</w:t>
+      </w:r>
+    </w:p>
+    <w:p>
+      <w:pPr>
+        <w:pStyle w:val="APA7Body"/>
+      </w:pPr>
+      <w:r>
+        <w:t xml:space="preserve">There is no data associated with this </w:t>
+      </w:r>
+      <w:r>
+        <w:t>manuscript</w:t>
+      </w:r>
+      <w:r>
+        <w:t xml:space="preserve">. All materials and code </w:t>
+      </w:r>
+      <w:r>
+        <w:t xml:space="preserve">are openly accessible on the Open Science </w:t>
+      </w:r>
+      <w:commentRangeStart w:id="84"/>
+      <w:r>
+        <w:t>Framework</w:t>
+      </w:r>
+      <w:commentRangeEnd w:id="84"/>
       <w:r>
         <w:rPr>
           <w:rStyle w:val="CommentReference"/>
           <w:sz w:val="24"/>
           <w:szCs w:val="36"/>
         </w:rPr>
-        <w:commentReference w:id="67"/>
+        <w:commentReference w:id="84"/>
       </w:r>
       <w:r>
         <w:t xml:space="preserve">: </w:t>
       </w:r>
-    </w:p>
-    <w:p>
-      <w:pPr>
-        <w:pStyle w:val="APA7Body"/>
-      </w:pPr>
-      <w:r>
-        <w:t>The csv output can then be used in experimental software to administer the procedure to participants.</w:t>
-      </w:r>
-    </w:p>
-    <w:p>
-      <w:pPr>
-        <w:pStyle w:val="APA7H2"/>
-      </w:pPr>
-      <w:r>
-        <w:t>Discussion</w:t>
-      </w:r>
-    </w:p>
-    <w:p>
-      <w:pPr>
-        <w:pStyle w:val="APA7Body"/>
-      </w:pPr>
-      <w:r>
-        <w:t xml:space="preserve">This manuscript describes what we refer to as derivation tables </w:t>
-      </w:r>
-      <w:r>
-        <w:t>that support a python module and algorithm for automated relational derivation. This algorithm, in turn, provides the foundation for a set of tools that are intended to facilitate research on relational reasoning.</w:t>
-      </w:r>
-      <w:r>
-        <w:t xml:space="preserve"> Specifically, we described </w:t>
-      </w:r>
-      <w:r>
-        <w:t xml:space="preserve">functions to visualize relational networks as graph networks, generate MTS procedures and generate syllogistic reasoning problems, all contained in the python module. We also described </w:t>
-      </w:r>
-      <w:r>
-        <w:t xml:space="preserve">online applications implementing the three tools in a more intuitive, </w:t>
-      </w:r>
-      <w:r>
-        <w:lastRenderedPageBreak/>
-        <w:t>code-free way, ready for researchers to use</w:t>
-      </w:r>
-      <w:r>
-        <w:t xml:space="preserve">. </w:t>
-      </w:r>
-      <w:r>
-        <w:t>The tutorials we provided illustrate their ease of use and utility.</w:t>
-      </w:r>
-    </w:p>
-    <w:p>
-      <w:pPr>
-        <w:pStyle w:val="APA7Body"/>
-      </w:pPr>
-      <w:r>
-        <w:t>While the derivation tables are limited to a set of (currently) about thirty relations</w:t>
-      </w:r>
-      <w:r>
-        <w:t>, they do provide a survey of the most commonly studied relations in psychological research</w:t>
-      </w:r>
-      <w:r>
-        <w:t xml:space="preserve"> and go beyond currently available similar tools (e.g., Smith &amp; Hayes, 2022; Carvalho et al., 2024)</w:t>
-      </w:r>
-      <w:r>
-        <w:t xml:space="preserve">. </w:t>
-      </w:r>
-      <w:r>
-        <w:t xml:space="preserve">The open-source nature of the tools invites researchers to add more relations themselves or study the generality of the underlying derivation algorithm </w:t>
-      </w:r>
-      <w:r>
-        <w:t xml:space="preserve">(i.e., </w:t>
-      </w:r>
-      <w:r>
-        <w:t>what other relations fit the same patterns of derivation currently accounted for in the algorithm)</w:t>
-      </w:r>
-      <w:r>
-        <w:t>.</w:t>
-      </w:r>
-      <w:r>
-        <w:t xml:space="preserve"> In that sense, we provide the building blocks for researchers to continue this work. </w:t>
-      </w:r>
-      <w:r>
-        <w:t>We only described three tools derived from the derivation tables and the relational derivation algorithm.</w:t>
-      </w:r>
-      <w:r>
-        <w:t xml:space="preserve"> </w:t>
-      </w:r>
-      <w:r>
-        <w:t>W</w:t>
-      </w:r>
-      <w:r>
-        <w:t xml:space="preserve">hile we believe that </w:t>
-      </w:r>
-      <w:r>
-        <w:t xml:space="preserve">graph visualization, MTS procedures and syllogistics reasoning problems could be of use to a </w:t>
-      </w:r>
-      <w:r>
-        <w:t xml:space="preserve">broad audience of relational reasoning researchers, we could have developed many other tools as well. Again, we hope that the derivation tables and algorithm can provide researchers with the building blocks they need to build </w:t>
-      </w:r>
-      <w:r>
-        <w:t xml:space="preserve">and share </w:t>
-      </w:r>
-      <w:r>
-        <w:t xml:space="preserve">their own tools </w:t>
-      </w:r>
-      <w:r>
-        <w:t xml:space="preserve">tailored to their specific research contexts. </w:t>
-      </w:r>
-    </w:p>
-    <w:p>
-      <w:pPr>
-        <w:pStyle w:val="APA7Body"/>
-      </w:pPr>
-      <w:r>
-        <w:t xml:space="preserve"> </w:t>
-      </w:r>
-      <w:r>
-        <w:t xml:space="preserve">Beyond practical benefits, work like this may also inspire theoretical or conceptual insights. </w:t>
-      </w:r>
-      <w:r>
-        <w:t xml:space="preserve">In our description of the derivation tables, we noted that </w:t>
-      </w:r>
-      <w:r>
-        <w:t>some</w:t>
-      </w:r>
-      <w:r>
-        <w:t xml:space="preserve"> relations </w:t>
-      </w:r>
-      <w:r>
-        <w:t>have distinct patterns of relational derivation</w:t>
-      </w:r>
-      <w:r>
-        <w:t>, but that many relations also have identical patterns (e.g., the relations more than – less than and larger than – smaller than).</w:t>
-      </w:r>
-      <w:r>
-        <w:t xml:space="preserve"> </w:t>
-      </w:r>
-      <w:r>
-        <w:t xml:space="preserve">Studying these patterns in more detail </w:t>
-      </w:r>
-      <w:r>
-        <w:t>might offer insights into how humans acquire the ability for relational reasoning</w:t>
-      </w:r>
-      <w:r>
-        <w:t xml:space="preserve">, and how it becomes so flexible. Researchers may also </w:t>
-      </w:r>
-      <w:r>
-        <w:t>find that the patterns contradict certain theoretical predictions. For instance, in relational frame theory (</w:t>
-      </w:r>
-      <w:r>
-        <w:t xml:space="preserve">Hayes et al., 2001), </w:t>
-      </w:r>
-      <w:r>
-        <w:t>the ability to respond to different kinds of relations is described as separate so-called relational frames (i.e., coordination, distinction, opposition, comparison, hierarchy, temporal, and</w:t>
-      </w:r>
-      <w:r>
-        <w:t xml:space="preserve"> so on</w:t>
-      </w:r>
-      <w:r>
-        <w:t>)</w:t>
-      </w:r>
-      <w:r>
-        <w:t xml:space="preserve">. Closer inspection of the patterns of derivation illustrated </w:t>
-      </w:r>
-      <w:r>
-        <w:t>in Figure 1</w:t>
-      </w:r>
-      <w:r>
-        <w:t xml:space="preserve">, however, reveals that some of these relations are very similar (i.e., the relational aspect is the </w:t>
-      </w:r>
-      <w:r>
-        <w:t>same, but the psychological function that is related differs) and might rather be conceived of as different instances of the same relational frame.</w:t>
-      </w:r>
-      <w:r>
-        <w:t xml:space="preserve"> A lengthy discussion is beyond the scope of this manuscript, but the point illustrates that this work can also inspire conceptual developments.</w:t>
-      </w:r>
-      <w:r>
-        <w:br w:type="page"/>
-      </w:r>
-    </w:p>
-    <w:p>
-      <w:pPr>
-        <w:pStyle w:val="APA7H1"/>
-      </w:pPr>
-      <w:r>
-        <w:lastRenderedPageBreak/>
-        <w:t>Declarations</w:t>
-      </w:r>
-    </w:p>
-    <w:p>
-      <w:pPr>
-        <w:pStyle w:val="APA7H2"/>
-      </w:pPr>
-      <w:r>
-        <w:t>Funding</w:t>
-      </w:r>
-      <w:r>
-        <w:t xml:space="preserve"> </w:t>
-      </w:r>
-    </w:p>
-    <w:p>
-      <w:pPr>
-        <w:pStyle w:val="APA7Body"/>
-      </w:pPr>
-      <w:r>
-        <w:t xml:space="preserve">This research was </w:t>
-      </w:r>
-      <w:r>
-        <w:t>supported</w:t>
-      </w:r>
-      <w:r>
-        <w:t xml:space="preserve"> by </w:t>
-      </w:r>
-      <w:r>
-        <w:t xml:space="preserve">Flemish Research Fund fundamental research grant </w:t>
-      </w:r>
-      <w:r>
-        <w:t>11M032</w:t>
-      </w:r>
-      <w:r>
-        <w:t>5</w:t>
-      </w:r>
-      <w:r>
-        <w:t>N</w:t>
-      </w:r>
-      <w:r>
-        <w:t xml:space="preserve"> to </w:t>
-      </w:r>
-      <w:r>
-        <w:t>the first author</w:t>
-      </w:r>
-      <w:r>
-        <w:t>.</w:t>
-      </w:r>
-      <w:r>
-        <w:t xml:space="preserve"> </w:t>
-      </w:r>
-      <w:r>
-        <w:t>The second author</w:t>
-      </w:r>
-      <w:r>
-        <w:t xml:space="preserve"> is supported</w:t>
-      </w:r>
-      <w:r>
-        <w:t xml:space="preserve"> Flemish Research Fund</w:t>
-      </w:r>
-      <w:r>
-        <w:t xml:space="preserve"> grant </w:t>
-      </w:r>
-      <w:r>
-        <w:rPr>
-          <w:lang w:val="en-GB"/>
-        </w:rPr>
-        <w:t>12A2B26N</w:t>
-      </w:r>
-      <w:r>
-        <w:rPr>
-          <w:lang w:val="en-GB"/>
-        </w:rPr>
-        <w:t>. The third author was supported</w:t>
-      </w:r>
-      <w:r>
-        <w:t xml:space="preserve"> by </w:t>
-      </w:r>
-      <w:r>
-        <w:t>grant BOF22/MET_V/002 - 01M00209 of Ghent University</w:t>
-      </w:r>
-      <w:r>
-        <w:t xml:space="preserve">’s. </w:t>
-      </w:r>
-    </w:p>
-    <w:p>
-      <w:pPr>
-        <w:pStyle w:val="APA7H2"/>
-      </w:pPr>
-      <w:r>
-        <w:t>Conflicts of interest/Competing interests</w:t>
-      </w:r>
-    </w:p>
-    <w:p>
-      <w:pPr>
-        <w:pStyle w:val="APA7Body"/>
-      </w:pPr>
-      <w:r>
-        <w:t>None</w:t>
-      </w:r>
-      <w:r>
-        <w:t xml:space="preserve"> to declare.</w:t>
+      <w:r>
+        <w:t>https://osf.io/bjxqg/overview?view_only=5ab9e17676a3436d9d7878d0b7e1340e</w:t>
       </w:r>
     </w:p>
     <w:p>
@@ -9559,117 +9734,6 @@
         <w:rPr>
           <w:b/>
         </w:rPr>
-        <w:t>Ethics approval</w:t>
-      </w:r>
-      <w:r>
-        <w:rPr>
-          <w:b/>
-        </w:rPr>
-        <w:t xml:space="preserve"> and consent to participate</w:t>
-      </w:r>
-    </w:p>
-    <w:p>
-      <w:pPr>
-        <w:pStyle w:val="APA7Body"/>
-      </w:pPr>
-      <w:r>
-        <w:t>Not applicable.</w:t>
-      </w:r>
-      <w:r>
-        <w:t xml:space="preserve"> This manuscript does not report on any </w:t>
-      </w:r>
-      <w:r>
-        <w:t>research involving participants.</w:t>
-      </w:r>
-    </w:p>
-    <w:p>
-      <w:pPr>
-        <w:pStyle w:val="APA7Body"/>
-        <w:ind w:firstLine="0"/>
-      </w:pPr>
-      <w:r>
-        <w:rPr>
-          <w:b/>
-        </w:rPr>
-        <w:t>Consent for publication</w:t>
-      </w:r>
-    </w:p>
-    <w:p>
-      <w:pPr>
-        <w:pStyle w:val="APA7Body"/>
-      </w:pPr>
-      <w:r>
-        <w:t xml:space="preserve">All authors have </w:t>
-      </w:r>
-      <w:r>
-        <w:t>read</w:t>
-      </w:r>
-      <w:r>
-        <w:t xml:space="preserve"> and agree with the publication of this version of the manuscript.</w:t>
-      </w:r>
-    </w:p>
-    <w:p>
-      <w:pPr>
-        <w:pStyle w:val="APA7H2"/>
-      </w:pPr>
-      <w:r>
-        <w:t>Availability of data</w:t>
-      </w:r>
-      <w:r>
-        <w:t xml:space="preserve">, </w:t>
-      </w:r>
-      <w:r>
-        <w:t>materials</w:t>
-      </w:r>
-      <w:r>
-        <w:t xml:space="preserve"> and code</w:t>
-      </w:r>
-    </w:p>
-    <w:p>
-      <w:pPr>
-        <w:pStyle w:val="APA7Body"/>
-      </w:pPr>
-      <w:r>
-        <w:t xml:space="preserve">There is no data associated with this </w:t>
-      </w:r>
-      <w:r>
-        <w:t>manuscript</w:t>
-      </w:r>
-      <w:r>
-        <w:t xml:space="preserve">. All materials and code </w:t>
-      </w:r>
-      <w:r>
-        <w:t xml:space="preserve">are openly accessible on the Open Science </w:t>
-      </w:r>
-      <w:commentRangeStart w:id="68"/>
-      <w:r>
-        <w:t>Framework</w:t>
-      </w:r>
-      <w:commentRangeEnd w:id="68"/>
-      <w:r>
-        <w:rPr>
-          <w:rStyle w:val="CommentReference"/>
-          <w:sz w:val="24"/>
-          <w:szCs w:val="36"/>
-        </w:rPr>
-        <w:commentReference w:id="68"/>
-      </w:r>
-      <w:r>
-        <w:t xml:space="preserve">: </w:t>
-      </w:r>
-      <w:r>
-        <w:t>https://osf.io/bjxqg/overview?view_only=5ab9e17676a3436d9d7878d0b7e1340e</w:t>
-      </w:r>
-    </w:p>
-    <w:p>
-      <w:pPr>
-        <w:pStyle w:val="APA7Body"/>
-        <w:ind w:firstLine="0"/>
-      </w:pPr>
-      <w:r>
-        <w:rPr>
-          <w:b/>
-        </w:rPr>
         <w:t>Authors' contributions</w:t>
       </w:r>
       <w:r>
@@ -9690,7 +9754,7 @@
       <w:r>
         <w:t xml:space="preserve">: </w:t>
       </w:r>
-      <w:bookmarkStart w:id="69" w:name="_Hlk208350533"/>
+      <w:bookmarkStart w:id="85" w:name="_Hlk208350533"/>
       <w:r>
         <w:t xml:space="preserve">Conceptualization, Funding </w:t>
       </w:r>
@@ -9700,7 +9764,7 @@
       <w:r>
         <w:t>, Methodology, Project Administration, Resources, Software, Supervision, Visualization, Writing – Original Draft, Writing – Review and Editing</w:t>
       </w:r>
-      <w:bookmarkEnd w:id="69"/>
+      <w:bookmarkEnd w:id="85"/>
       <w:r>
         <w:t xml:space="preserve">; </w:t>
       </w:r>
@@ -10021,7 +10085,7 @@
       </w:r>
     </w:p>
   </w:comment>
-  <w:comment w:id="64" w:author="Matthias Raemaekers" w:date="2026-07-30T16:11:00Z" w:initials="MR">
+  <w:comment w:id="83" w:author="Matthias Raemaekers" w:date="2026-08-21T15:29:00Z" w:initials="MR">
     <w:p>
       <w:pPr>
         <w:pStyle w:val="CommentText"/>
@@ -10036,68 +10100,11 @@
         <w:rPr>
           <w:lang w:val="nl-BE"/>
         </w:rPr>
-        <w:t>Fix Legend location</w:t>
+        <w:t>Finish when software is final.</w:t>
       </w:r>
     </w:p>
   </w:comment>
-  <w:comment w:id="65" w:author="Matthias Raemaekers" w:date="2026-09-28T11:07:00Z" w:initials="MR">
-    <w:p>
-      <w:pPr>
-        <w:pStyle w:val="CommentText"/>
-      </w:pPr>
-      <w:r>
-        <w:rPr>
-          <w:rStyle w:val="CommentReference"/>
-        </w:rPr>
-        <w:annotationRef/>
-      </w:r>
-      <w:r>
-        <w:rPr>
-          <w:lang w:val="nl-BE"/>
-        </w:rPr>
-        <w:t>+ make less busy</w:t>
-      </w:r>
-    </w:p>
-  </w:comment>
-  <w:comment w:id="66" w:author="Matthias Raemaekers" w:date="2026-07-30T16:12:00Z" w:initials="MR">
-    <w:p>
-      <w:pPr>
-        <w:pStyle w:val="CommentText"/>
-      </w:pPr>
-      <w:r>
-        <w:rPr>
-          <w:rStyle w:val="CommentReference"/>
-        </w:rPr>
-        <w:annotationRef/>
-      </w:r>
-      <w:r>
-        <w:rPr>
-          <w:lang w:val="nl-BE"/>
-        </w:rPr>
-        <w:t>Fix app then finish section</w:t>
-      </w:r>
-    </w:p>
-  </w:comment>
-  <w:comment w:id="67" w:author="Matthias Raemaekers" w:date="2026-08-21T15:29:00Z" w:initials="MR">
-    <w:p>
-      <w:pPr>
-        <w:pStyle w:val="CommentText"/>
-      </w:pPr>
-      <w:r>
-        <w:rPr>
-          <w:rStyle w:val="CommentReference"/>
-        </w:rPr>
-        <w:annotationRef/>
-      </w:r>
-      <w:r>
-        <w:rPr>
-          <w:lang w:val="nl-BE"/>
-        </w:rPr>
-        <w:t>Finish when software is final.</w:t>
-      </w:r>
-    </w:p>
-  </w:comment>
-  <w:comment w:id="68" w:author="Matthias Raemaekers" w:date="2026-07-15T11:03:00Z" w:initials="MR">
+  <w:comment w:id="84" w:author="Matthias Raemaekers" w:date="2026-07-15T11:03:00Z" w:initials="MR">
     <w:p>
       <w:pPr>
         <w:pStyle w:val="CommentText"/>
@@ -10131,9 +10138,6 @@
   <w15:commentEx w15:paraId="10ECC1ED" w15:paraIdParent="2011806A" w15:done="0"/>
   <w15:commentEx w15:paraId="497BF004" w15:paraIdParent="2011806A" w15:done="0"/>
   <w15:commentEx w15:paraId="7FC09C36" w15:done="0"/>
-  <w15:commentEx w15:paraId="3042CEC6" w15:done="0"/>
-  <w15:commentEx w15:paraId="377CE4AD" w15:paraIdParent="3042CEC6" w15:done="0"/>
-  <w15:commentEx w15:paraId="33AB8BCD" w15:done="0"/>
   <w15:commentEx w15:paraId="4B6A4406" w15:done="0"/>
   <w15:commentEx w15:paraId="0E3B1798" w15:done="0"/>
 </w15:commentsEx>
@@ -10151,9 +10155,6 @@
   <w16cex:commentExtensible w16cex:durableId="6D9546E3" w16cex:dateUtc="2026-07-09T08:42:00Z"/>
   <w16cex:commentExtensible w16cex:durableId="63CF0987" w16cex:dateUtc="2026-07-10T12:06:00Z"/>
   <w16cex:commentExtensible w16cex:durableId="7215CE6F" w16cex:dateUtc="2026-08-20T14:20:00Z"/>
-  <w16cex:commentExtensible w16cex:durableId="7A773EAA" w16cex:dateUtc="2026-07-30T14:11:00Z"/>
-  <w16cex:commentExtensible w16cex:durableId="1202AA16" w16cex:dateUtc="2026-09-28T09:07:00Z"/>
-  <w16cex:commentExtensible w16cex:durableId="22B33508" w16cex:dateUtc="2026-07-30T14:12:00Z"/>
   <w16cex:commentExtensible w16cex:durableId="3079A773" w16cex:dateUtc="2026-08-21T13:29:00Z"/>
   <w16cex:commentExtensible w16cex:durableId="7F167AAA" w16cex:dateUtc="2026-07-15T09:03:00Z"/>
 </w16cex:commentsExtensible>
@@ -10171,9 +10172,6 @@
   <w16cid:commentId w16cid:paraId="10ECC1ED" w16cid:durableId="6D9546E3"/>
   <w16cid:commentId w16cid:paraId="497BF004" w16cid:durableId="63CF0987"/>
   <w16cid:commentId w16cid:paraId="7FC09C36" w16cid:durableId="7215CE6F"/>
-  <w16cid:commentId w16cid:paraId="3042CEC6" w16cid:durableId="7A773EAA"/>
-  <w16cid:commentId w16cid:paraId="377CE4AD" w16cid:durableId="1202AA16"/>
-  <w16cid:commentId w16cid:paraId="33AB8BCD" w16cid:durableId="22B33508"/>
   <w16cid:commentId w16cid:paraId="4B6A4406" w16cid:durableId="3079A773"/>
   <w16cid:commentId w16cid:paraId="0E3B1798" w16cid:durableId="7F167AAA"/>
 </w16cid:commentsIds>

</xml_diff>